<commit_message>
Corregir el docx: orden de elementos en w:pPr y partes que faltaban
Word aplica el orden del esquema OOXML dentro de w:pPr (pStyle, numPr, pBdr,
spacing, ind, outlineLvl) y rechazaba el fichero. Se corrige el generador y se
anaden settings.xml y docProps, que Word espera en un paquete normal.
</commit_message>
<xml_diff>
--- a/projects/2026-propuesta-tesis/Guion_reunion_Catedra_UNESCO.docx
+++ b/projects/2026-propuesta-tesis/Guion_reunion_Catedra_UNESCO.docx
@@ -1,6 +1,6 @@
 
 <file path=word/document.xml><?xml version="1.0" encoding="utf-8"?>
-<w:document xmlns:w="http://schemas.openxmlformats.org/wordprocessingml/2006/main">
+<w:document xmlns:w="http://schemas.openxmlformats.org/wordprocessingml/2006/main" xmlns:r="http://schemas.openxmlformats.org/officeDocument/2006/relationships" xmlns:xml="http://www.w3.org/XML/1998/namespace">
   <w:body>
     <w:p>
       <w:pPr>
@@ -24,10 +24,10 @@
     </w:p>
     <w:p>
       <w:pPr>
+        <w:pBdr>
+          <w:bottom w:val="single" w:sz="4" w:space="1" w:color="BFC9C2"/>
+        </w:pBdr>
         <w:spacing w:before="0" w:after="240" w:line="264" w:lineRule="auto"/>
-        <w:pBdr>
-          <w:bottom w:val="single" w:sz="4" w:space="1" w:color="BFC9C2"/>
-        </w:pBdr>
       </w:pPr>
       <w:r>
         <w:rPr>
@@ -414,26 +414,26 @@
     </w:p>
     <w:p>
       <w:pPr>
-        <w:spacing w:before="0" w:after="200" w:line="264" w:lineRule="auto"/>
-        <w:pBdr>
-          <w:bottom w:val="single" w:sz="4" w:space="1" w:color="BFC9C2"/>
-        </w:pBdr>
-      </w:pPr>
-    </w:p>
-    <w:p>
-      <w:pPr>
-        <w:spacing w:before="0" w:after="200" w:line="264" w:lineRule="auto"/>
-        <w:pBdr>
-          <w:bottom w:val="single" w:sz="4" w:space="1" w:color="BFC9C2"/>
-        </w:pBdr>
-      </w:pPr>
-    </w:p>
-    <w:p>
-      <w:pPr>
-        <w:spacing w:before="0" w:after="200" w:line="264" w:lineRule="auto"/>
-        <w:pBdr>
-          <w:bottom w:val="single" w:sz="4" w:space="1" w:color="BFC9C2"/>
-        </w:pBdr>
+        <w:pBdr>
+          <w:bottom w:val="single" w:sz="4" w:space="1" w:color="BFC9C2"/>
+        </w:pBdr>
+        <w:spacing w:before="0" w:after="200" w:line="264" w:lineRule="auto"/>
+      </w:pPr>
+    </w:p>
+    <w:p>
+      <w:pPr>
+        <w:pBdr>
+          <w:bottom w:val="single" w:sz="4" w:space="1" w:color="BFC9C2"/>
+        </w:pBdr>
+        <w:spacing w:before="0" w:after="200" w:line="264" w:lineRule="auto"/>
+      </w:pPr>
+    </w:p>
+    <w:p>
+      <w:pPr>
+        <w:pBdr>
+          <w:bottom w:val="single" w:sz="4" w:space="1" w:color="BFC9C2"/>
+        </w:pBdr>
+        <w:spacing w:before="0" w:after="200" w:line="264" w:lineRule="auto"/>
       </w:pPr>
     </w:p>
     <w:p>
@@ -448,26 +448,26 @@
     </w:p>
     <w:p>
       <w:pPr>
-        <w:spacing w:before="0" w:after="200" w:line="264" w:lineRule="auto"/>
-        <w:pBdr>
-          <w:bottom w:val="single" w:sz="4" w:space="1" w:color="BFC9C2"/>
-        </w:pBdr>
-      </w:pPr>
-    </w:p>
-    <w:p>
-      <w:pPr>
-        <w:spacing w:before="0" w:after="200" w:line="264" w:lineRule="auto"/>
-        <w:pBdr>
-          <w:bottom w:val="single" w:sz="4" w:space="1" w:color="BFC9C2"/>
-        </w:pBdr>
-      </w:pPr>
-    </w:p>
-    <w:p>
-      <w:pPr>
-        <w:spacing w:before="0" w:after="200" w:line="264" w:lineRule="auto"/>
-        <w:pBdr>
-          <w:bottom w:val="single" w:sz="4" w:space="1" w:color="BFC9C2"/>
-        </w:pBdr>
+        <w:pBdr>
+          <w:bottom w:val="single" w:sz="4" w:space="1" w:color="BFC9C2"/>
+        </w:pBdr>
+        <w:spacing w:before="0" w:after="200" w:line="264" w:lineRule="auto"/>
+      </w:pPr>
+    </w:p>
+    <w:p>
+      <w:pPr>
+        <w:pBdr>
+          <w:bottom w:val="single" w:sz="4" w:space="1" w:color="BFC9C2"/>
+        </w:pBdr>
+        <w:spacing w:before="0" w:after="200" w:line="264" w:lineRule="auto"/>
+      </w:pPr>
+    </w:p>
+    <w:p>
+      <w:pPr>
+        <w:pBdr>
+          <w:bottom w:val="single" w:sz="4" w:space="1" w:color="BFC9C2"/>
+        </w:pBdr>
+        <w:spacing w:before="0" w:after="200" w:line="264" w:lineRule="auto"/>
       </w:pPr>
     </w:p>
     <w:p>
@@ -496,26 +496,26 @@
     </w:p>
     <w:p>
       <w:pPr>
-        <w:spacing w:before="0" w:after="200" w:line="264" w:lineRule="auto"/>
-        <w:pBdr>
-          <w:bottom w:val="single" w:sz="4" w:space="1" w:color="BFC9C2"/>
-        </w:pBdr>
-      </w:pPr>
-    </w:p>
-    <w:p>
-      <w:pPr>
-        <w:spacing w:before="0" w:after="200" w:line="264" w:lineRule="auto"/>
-        <w:pBdr>
-          <w:bottom w:val="single" w:sz="4" w:space="1" w:color="BFC9C2"/>
-        </w:pBdr>
-      </w:pPr>
-    </w:p>
-    <w:p>
-      <w:pPr>
-        <w:spacing w:before="0" w:after="200" w:line="264" w:lineRule="auto"/>
-        <w:pBdr>
-          <w:bottom w:val="single" w:sz="4" w:space="1" w:color="BFC9C2"/>
-        </w:pBdr>
+        <w:pBdr>
+          <w:bottom w:val="single" w:sz="4" w:space="1" w:color="BFC9C2"/>
+        </w:pBdr>
+        <w:spacing w:before="0" w:after="200" w:line="264" w:lineRule="auto"/>
+      </w:pPr>
+    </w:p>
+    <w:p>
+      <w:pPr>
+        <w:pBdr>
+          <w:bottom w:val="single" w:sz="4" w:space="1" w:color="BFC9C2"/>
+        </w:pBdr>
+        <w:spacing w:before="0" w:after="200" w:line="264" w:lineRule="auto"/>
+      </w:pPr>
+    </w:p>
+    <w:p>
+      <w:pPr>
+        <w:pBdr>
+          <w:bottom w:val="single" w:sz="4" w:space="1" w:color="BFC9C2"/>
+        </w:pBdr>
+        <w:spacing w:before="0" w:after="200" w:line="264" w:lineRule="auto"/>
       </w:pPr>
     </w:p>
     <w:p>
@@ -544,26 +544,26 @@
     </w:p>
     <w:p>
       <w:pPr>
-        <w:spacing w:before="0" w:after="200" w:line="264" w:lineRule="auto"/>
-        <w:pBdr>
-          <w:bottom w:val="single" w:sz="4" w:space="1" w:color="BFC9C2"/>
-        </w:pBdr>
-      </w:pPr>
-    </w:p>
-    <w:p>
-      <w:pPr>
-        <w:spacing w:before="0" w:after="200" w:line="264" w:lineRule="auto"/>
-        <w:pBdr>
-          <w:bottom w:val="single" w:sz="4" w:space="1" w:color="BFC9C2"/>
-        </w:pBdr>
-      </w:pPr>
-    </w:p>
-    <w:p>
-      <w:pPr>
-        <w:spacing w:before="0" w:after="200" w:line="264" w:lineRule="auto"/>
-        <w:pBdr>
-          <w:bottom w:val="single" w:sz="4" w:space="1" w:color="BFC9C2"/>
-        </w:pBdr>
+        <w:pBdr>
+          <w:bottom w:val="single" w:sz="4" w:space="1" w:color="BFC9C2"/>
+        </w:pBdr>
+        <w:spacing w:before="0" w:after="200" w:line="264" w:lineRule="auto"/>
+      </w:pPr>
+    </w:p>
+    <w:p>
+      <w:pPr>
+        <w:pBdr>
+          <w:bottom w:val="single" w:sz="4" w:space="1" w:color="BFC9C2"/>
+        </w:pBdr>
+        <w:spacing w:before="0" w:after="200" w:line="264" w:lineRule="auto"/>
+      </w:pPr>
+    </w:p>
+    <w:p>
+      <w:pPr>
+        <w:pBdr>
+          <w:bottom w:val="single" w:sz="4" w:space="1" w:color="BFC9C2"/>
+        </w:pBdr>
+        <w:spacing w:before="0" w:after="200" w:line="264" w:lineRule="auto"/>
       </w:pPr>
     </w:p>
     <w:p>
@@ -578,26 +578,26 @@
     </w:p>
     <w:p>
       <w:pPr>
-        <w:spacing w:before="0" w:after="200" w:line="264" w:lineRule="auto"/>
-        <w:pBdr>
-          <w:bottom w:val="single" w:sz="4" w:space="1" w:color="BFC9C2"/>
-        </w:pBdr>
-      </w:pPr>
-    </w:p>
-    <w:p>
-      <w:pPr>
-        <w:spacing w:before="0" w:after="200" w:line="264" w:lineRule="auto"/>
-        <w:pBdr>
-          <w:bottom w:val="single" w:sz="4" w:space="1" w:color="BFC9C2"/>
-        </w:pBdr>
-      </w:pPr>
-    </w:p>
-    <w:p>
-      <w:pPr>
-        <w:spacing w:before="0" w:after="200" w:line="264" w:lineRule="auto"/>
-        <w:pBdr>
-          <w:bottom w:val="single" w:sz="4" w:space="1" w:color="BFC9C2"/>
-        </w:pBdr>
+        <w:pBdr>
+          <w:bottom w:val="single" w:sz="4" w:space="1" w:color="BFC9C2"/>
+        </w:pBdr>
+        <w:spacing w:before="0" w:after="200" w:line="264" w:lineRule="auto"/>
+      </w:pPr>
+    </w:p>
+    <w:p>
+      <w:pPr>
+        <w:pBdr>
+          <w:bottom w:val="single" w:sz="4" w:space="1" w:color="BFC9C2"/>
+        </w:pBdr>
+        <w:spacing w:before="0" w:after="200" w:line="264" w:lineRule="auto"/>
+      </w:pPr>
+    </w:p>
+    <w:p>
+      <w:pPr>
+        <w:pBdr>
+          <w:bottom w:val="single" w:sz="4" w:space="1" w:color="BFC9C2"/>
+        </w:pBdr>
+        <w:spacing w:before="0" w:after="200" w:line="264" w:lineRule="auto"/>
       </w:pPr>
     </w:p>
     <w:p>
@@ -612,34 +612,34 @@
     </w:p>
     <w:p>
       <w:pPr>
-        <w:spacing w:before="0" w:after="200" w:line="264" w:lineRule="auto"/>
-        <w:pBdr>
-          <w:bottom w:val="single" w:sz="4" w:space="1" w:color="BFC9C2"/>
-        </w:pBdr>
-      </w:pPr>
-    </w:p>
-    <w:p>
-      <w:pPr>
-        <w:spacing w:before="0" w:after="200" w:line="264" w:lineRule="auto"/>
-        <w:pBdr>
-          <w:bottom w:val="single" w:sz="4" w:space="1" w:color="BFC9C2"/>
-        </w:pBdr>
-      </w:pPr>
-    </w:p>
-    <w:p>
-      <w:pPr>
-        <w:spacing w:before="0" w:after="200" w:line="264" w:lineRule="auto"/>
-        <w:pBdr>
-          <w:bottom w:val="single" w:sz="4" w:space="1" w:color="BFC9C2"/>
-        </w:pBdr>
-      </w:pPr>
-    </w:p>
-    <w:p>
-      <w:pPr>
-        <w:spacing w:before="0" w:after="200" w:line="264" w:lineRule="auto"/>
-        <w:pBdr>
-          <w:bottom w:val="single" w:sz="4" w:space="1" w:color="BFC9C2"/>
-        </w:pBdr>
+        <w:pBdr>
+          <w:bottom w:val="single" w:sz="4" w:space="1" w:color="BFC9C2"/>
+        </w:pBdr>
+        <w:spacing w:before="0" w:after="200" w:line="264" w:lineRule="auto"/>
+      </w:pPr>
+    </w:p>
+    <w:p>
+      <w:pPr>
+        <w:pBdr>
+          <w:bottom w:val="single" w:sz="4" w:space="1" w:color="BFC9C2"/>
+        </w:pBdr>
+        <w:spacing w:before="0" w:after="200" w:line="264" w:lineRule="auto"/>
+      </w:pPr>
+    </w:p>
+    <w:p>
+      <w:pPr>
+        <w:pBdr>
+          <w:bottom w:val="single" w:sz="4" w:space="1" w:color="BFC9C2"/>
+        </w:pBdr>
+        <w:spacing w:before="0" w:after="200" w:line="264" w:lineRule="auto"/>
+      </w:pPr>
+    </w:p>
+    <w:p>
+      <w:pPr>
+        <w:pBdr>
+          <w:bottom w:val="single" w:sz="4" w:space="1" w:color="BFC9C2"/>
+        </w:pBdr>
+        <w:spacing w:before="0" w:after="200" w:line="264" w:lineRule="auto"/>
       </w:pPr>
     </w:p>
     <w:p>
@@ -654,66 +654,66 @@
     </w:p>
     <w:p>
       <w:pPr>
-        <w:spacing w:before="0" w:after="200" w:line="264" w:lineRule="auto"/>
-        <w:pBdr>
-          <w:bottom w:val="single" w:sz="4" w:space="1" w:color="BFC9C2"/>
-        </w:pBdr>
-      </w:pPr>
-    </w:p>
-    <w:p>
-      <w:pPr>
-        <w:spacing w:before="0" w:after="200" w:line="264" w:lineRule="auto"/>
-        <w:pBdr>
-          <w:bottom w:val="single" w:sz="4" w:space="1" w:color="BFC9C2"/>
-        </w:pBdr>
-      </w:pPr>
-    </w:p>
-    <w:p>
-      <w:pPr>
-        <w:spacing w:before="0" w:after="200" w:line="264" w:lineRule="auto"/>
-        <w:pBdr>
-          <w:bottom w:val="single" w:sz="4" w:space="1" w:color="BFC9C2"/>
-        </w:pBdr>
-      </w:pPr>
-    </w:p>
-    <w:p>
-      <w:pPr>
-        <w:spacing w:before="0" w:after="200" w:line="264" w:lineRule="auto"/>
-        <w:pBdr>
-          <w:bottom w:val="single" w:sz="4" w:space="1" w:color="BFC9C2"/>
-        </w:pBdr>
-      </w:pPr>
-    </w:p>
-    <w:p>
-      <w:pPr>
-        <w:spacing w:before="0" w:after="200" w:line="264" w:lineRule="auto"/>
-        <w:pBdr>
-          <w:bottom w:val="single" w:sz="4" w:space="1" w:color="BFC9C2"/>
-        </w:pBdr>
-      </w:pPr>
-    </w:p>
-    <w:p>
-      <w:pPr>
-        <w:spacing w:before="0" w:after="200" w:line="264" w:lineRule="auto"/>
-        <w:pBdr>
-          <w:bottom w:val="single" w:sz="4" w:space="1" w:color="BFC9C2"/>
-        </w:pBdr>
-      </w:pPr>
-    </w:p>
-    <w:p>
-      <w:pPr>
-        <w:spacing w:before="0" w:after="200" w:line="264" w:lineRule="auto"/>
-        <w:pBdr>
-          <w:bottom w:val="single" w:sz="4" w:space="1" w:color="BFC9C2"/>
-        </w:pBdr>
-      </w:pPr>
-    </w:p>
-    <w:p>
-      <w:pPr>
-        <w:spacing w:before="0" w:after="200" w:line="264" w:lineRule="auto"/>
-        <w:pBdr>
-          <w:bottom w:val="single" w:sz="4" w:space="1" w:color="BFC9C2"/>
-        </w:pBdr>
+        <w:pBdr>
+          <w:bottom w:val="single" w:sz="4" w:space="1" w:color="BFC9C2"/>
+        </w:pBdr>
+        <w:spacing w:before="0" w:after="200" w:line="264" w:lineRule="auto"/>
+      </w:pPr>
+    </w:p>
+    <w:p>
+      <w:pPr>
+        <w:pBdr>
+          <w:bottom w:val="single" w:sz="4" w:space="1" w:color="BFC9C2"/>
+        </w:pBdr>
+        <w:spacing w:before="0" w:after="200" w:line="264" w:lineRule="auto"/>
+      </w:pPr>
+    </w:p>
+    <w:p>
+      <w:pPr>
+        <w:pBdr>
+          <w:bottom w:val="single" w:sz="4" w:space="1" w:color="BFC9C2"/>
+        </w:pBdr>
+        <w:spacing w:before="0" w:after="200" w:line="264" w:lineRule="auto"/>
+      </w:pPr>
+    </w:p>
+    <w:p>
+      <w:pPr>
+        <w:pBdr>
+          <w:bottom w:val="single" w:sz="4" w:space="1" w:color="BFC9C2"/>
+        </w:pBdr>
+        <w:spacing w:before="0" w:after="200" w:line="264" w:lineRule="auto"/>
+      </w:pPr>
+    </w:p>
+    <w:p>
+      <w:pPr>
+        <w:pBdr>
+          <w:bottom w:val="single" w:sz="4" w:space="1" w:color="BFC9C2"/>
+        </w:pBdr>
+        <w:spacing w:before="0" w:after="200" w:line="264" w:lineRule="auto"/>
+      </w:pPr>
+    </w:p>
+    <w:p>
+      <w:pPr>
+        <w:pBdr>
+          <w:bottom w:val="single" w:sz="4" w:space="1" w:color="BFC9C2"/>
+        </w:pBdr>
+        <w:spacing w:before="0" w:after="200" w:line="264" w:lineRule="auto"/>
+      </w:pPr>
+    </w:p>
+    <w:p>
+      <w:pPr>
+        <w:pBdr>
+          <w:bottom w:val="single" w:sz="4" w:space="1" w:color="BFC9C2"/>
+        </w:pBdr>
+        <w:spacing w:before="0" w:after="200" w:line="264" w:lineRule="auto"/>
+      </w:pPr>
+    </w:p>
+    <w:p>
+      <w:pPr>
+        <w:pBdr>
+          <w:bottom w:val="single" w:sz="4" w:space="1" w:color="BFC9C2"/>
+        </w:pBdr>
+        <w:spacing w:before="0" w:after="200" w:line="264" w:lineRule="auto"/>
       </w:pPr>
     </w:p>
     <w:p>
@@ -776,6 +776,8 @@
 <file path=word/numbering.xml><?xml version="1.0" encoding="utf-8"?>
 <w:numbering xmlns:w="http://schemas.openxmlformats.org/wordprocessingml/2006/main">
   <w:abstractNum w:abstractNumId="0">
+    <w:nsid w:val="1A2B3C4D"/>
+    <w:multiLevelType w:val="hybridMultilevel"/>
     <w:lvl w:ilvl="0">
       <w:start w:val="1"/>
       <w:numFmt w:val="bullet"/>
@@ -844,10 +846,10 @@
     <w:basedOn w:val="Normal"/>
     <w:qFormat/>
     <w:pPr>
-      <w:outlineLvl w:val="0"/>
       <w:pBdr>
         <w:bottom w:val="single" w:sz="6" w:space="4" w:color="2C6A4C"/>
       </w:pBdr>
+      <w:outlineLvl w:val="0"/>
     </w:pPr>
     <w:rPr>
       <w:rFonts w:ascii="Cambria" w:hAnsi="Cambria"/>
@@ -876,10 +878,10 @@
     <w:basedOn w:val="Normal"/>
     <w:qFormat/>
     <w:pPr>
-      <w:ind w:left="284"/>
       <w:pBdr>
         <w:left w:val="single" w:sz="18" w:space="8" w:color="2C6A4C"/>
       </w:pBdr>
+      <w:ind w:left="284"/>
     </w:pPr>
     <w:rPr>
       <w:rFonts w:ascii="Cambria" w:hAnsi="Cambria"/>

</xml_diff>

<commit_message>
Incorporar Ecomania al contexto, al dosier y al guion de reunion
Anade el modelo de cuatro ejes de cosmovision ecologica y su instrumento
como cuarto activo: refuerza el hueco de constructo (que tipo de verde
frente a cuanto verde) y abre la validacion factorial como articulo
separable. Registra las cautelas: el producto no esta construido, el
supuesto de autoseleccion no se cumple en poblacion escolar, y hay datos
de categoria especial con menores.

Anade a Alvaro Francisco Gil a people.md y doce referencias del value-system
a la cola de lectura. Corrige la ruta de salida de build_guion.py, que
estaba escrita a fuego y no funcionaba fuera del equipo de Janire.
</commit_message>
<xml_diff>
--- a/projects/2026-propuesta-tesis/Guion_reunion_Catedra_UNESCO.docx
+++ b/projects/2026-propuesta-tesis/Guion_reunion_Catedra_UNESCO.docx
@@ -299,6 +299,25 @@
     </w:p>
     <w:p>
       <w:pPr>
+        <w:numPr>
+          <w:ilvl w:val="0"/>
+          <w:numId w:val="1"/>
+        </w:numPr>
+        <w:spacing w:before="0" w:after="120" w:line="264" w:lineRule="auto"/>
+      </w:pPr>
+      <w:r>
+        <w:rPr>
+          <w:b/>
+        </w:rPr>
+        <w:t xml:space="preserve">Un modelo de cuatro ejes de cosmovisión ecológica, y su encuesta.</w:t>
+      </w:r>
+      <w:r>
+        <w:rPr/>
+        <w:t xml:space="preserve"> Proyecto Ecomanía, con Álvaro Francisco Gil: yo desarrollo los ejes y los instrumentos, él el software. Ejes antropocéntrico/ecocéntrico, tecnológico/suficiencia, individual/colectivo y tecnocrático/de base, derivados del NEP, del Environmental Attitudes Inventory y de la teoría cultural del riesgo. Separa qué tipo de verde de cuánto verde — que es justo el riesgo de un 2×2 donde todo el alumnado salga moderadamente verde. Le falta validación factorial sobre datos reales.</w:t>
+      </w:r>
+    </w:p>
+    <w:p>
+      <w:pPr>
         <w:pStyle w:val="Heading2"/>
         <w:spacing w:before="180" w:after="60" w:line="264" w:lineRule="auto"/>
       </w:pPr>
@@ -362,6 +381,25 @@
       <w:r>
         <w:rPr/>
         <w:t xml:space="preserve"> Extender los talleres a Segovia y La Rioja es una vía que quiero abrir con mi organización. A día de hoy no está cerrada.</w:t>
+      </w:r>
+    </w:p>
+    <w:p>
+      <w:pPr>
+        <w:numPr>
+          <w:ilvl w:val="0"/>
+          <w:numId w:val="1"/>
+        </w:numPr>
+        <w:spacing w:before="0" w:after="120" w:line="264" w:lineRule="auto"/>
+      </w:pPr>
+      <w:r>
+        <w:rPr>
+          <w:b/>
+        </w:rPr>
+        <w:t xml:space="preserve">Datos de Ecomanía.</w:t>
+      </w:r>
+      <w:r>
+        <w:rPr/>
+        <w:t xml:space="preserve"> El producto no está construido: no hay encuesta implementada ni respuestas recogidas. Lo que llevo es el modelo y el diseño del instrumento. Además, el modelo asume usuarios ya concienciados que se autoseleccionan; el alumnado de un instituto no lo está.</w:t>
       </w:r>
     </w:p>
     <w:p>
@@ -607,7 +645,103 @@
       </w:pPr>
       <w:r>
         <w:rPr/>
-        <w:t xml:space="preserve">6. ¿Qué le falta a esta idea para ser una tesis?</w:t>
+        <w:t xml:space="preserve">6. ¿Vería publicable una validación factorial del modelo de cuatro ejes?</w:t>
+      </w:r>
+    </w:p>
+    <w:p>
+      <w:pPr>
+        <w:spacing w:before="0" w:after="120" w:line="264" w:lineRule="auto"/>
+      </w:pPr>
+      <w:r>
+        <w:rPr>
+          <w:i/>
+          <w:color w:val="5F6F66"/>
+          <w:sz w:val="19"/>
+          <w:szCs w:val="19"/>
+        </w:rPr>
+        <w:t xml:space="preserve">Artículo metodológico separable de la tesis. Le ofrezco algo, no solo pido. Hablarlo antes con Álvaro.</w:t>
+      </w:r>
+    </w:p>
+    <w:p>
+      <w:pPr>
+        <w:pBdr>
+          <w:bottom w:val="single" w:sz="4" w:space="1" w:color="BFC9C2"/>
+        </w:pBdr>
+        <w:spacing w:before="0" w:after="200" w:line="264" w:lineRule="auto"/>
+      </w:pPr>
+    </w:p>
+    <w:p>
+      <w:pPr>
+        <w:pBdr>
+          <w:bottom w:val="single" w:sz="4" w:space="1" w:color="BFC9C2"/>
+        </w:pBdr>
+        <w:spacing w:before="0" w:after="200" w:line="264" w:lineRule="auto"/>
+      </w:pPr>
+    </w:p>
+    <w:p>
+      <w:pPr>
+        <w:pBdr>
+          <w:bottom w:val="single" w:sz="4" w:space="1" w:color="BFC9C2"/>
+        </w:pBdr>
+        <w:spacing w:before="0" w:after="200" w:line="264" w:lineRule="auto"/>
+      </w:pPr>
+    </w:p>
+    <w:p>
+      <w:pPr>
+        <w:pStyle w:val="Heading2"/>
+        <w:spacing w:before="200" w:after="40" w:line="264" w:lineRule="auto"/>
+      </w:pPr>
+      <w:r>
+        <w:rPr/>
+        <w:t xml:space="preserve">7. ¿Qué implicaciones éticas tendría pasar un instrumento de valores a menores en centros?</w:t>
+      </w:r>
+    </w:p>
+    <w:p>
+      <w:pPr>
+        <w:spacing w:before="0" w:after="120" w:line="264" w:lineRule="auto"/>
+      </w:pPr>
+      <w:r>
+        <w:rPr>
+          <w:i/>
+          <w:color w:val="5F6F66"/>
+          <w:sz w:val="19"/>
+          <w:szCs w:val="19"/>
+        </w:rPr>
+        <w:t xml:space="preserve">Dato de categoría especial, consentimiento parental, comité de ética.</w:t>
+      </w:r>
+    </w:p>
+    <w:p>
+      <w:pPr>
+        <w:pBdr>
+          <w:bottom w:val="single" w:sz="4" w:space="1" w:color="BFC9C2"/>
+        </w:pBdr>
+        <w:spacing w:before="0" w:after="200" w:line="264" w:lineRule="auto"/>
+      </w:pPr>
+    </w:p>
+    <w:p>
+      <w:pPr>
+        <w:pBdr>
+          <w:bottom w:val="single" w:sz="4" w:space="1" w:color="BFC9C2"/>
+        </w:pBdr>
+        <w:spacing w:before="0" w:after="200" w:line="264" w:lineRule="auto"/>
+      </w:pPr>
+    </w:p>
+    <w:p>
+      <w:pPr>
+        <w:pBdr>
+          <w:bottom w:val="single" w:sz="4" w:space="1" w:color="BFC9C2"/>
+        </w:pBdr>
+        <w:spacing w:before="0" w:after="200" w:line="264" w:lineRule="auto"/>
+      </w:pPr>
+    </w:p>
+    <w:p>
+      <w:pPr>
+        <w:pStyle w:val="Heading2"/>
+        <w:spacing w:before="200" w:after="40" w:line="264" w:lineRule="auto"/>
+      </w:pPr>
+      <w:r>
+        <w:rPr/>
+        <w:t xml:space="preserve">8. ¿Qué le falta a esta idea para ser una tesis?</w:t>
       </w:r>
     </w:p>
     <w:p>
@@ -737,6 +871,19 @@
       <w:r>
         <w:rPr/>
         <w:t xml:space="preserve">Escribir a Fundación Renovables: extensión de talleres a Segovia y La Rioja, y uso del material con fines de investigación.</w:t>
+      </w:r>
+    </w:p>
+    <w:p>
+      <w:pPr>
+        <w:numPr>
+          <w:ilvl w:val="0"/>
+          <w:numId w:val="1"/>
+        </w:numPr>
+        <w:spacing w:before="0" w:after="120" w:line="264" w:lineRule="auto"/>
+      </w:pPr>
+      <w:r>
+        <w:rPr/>
+        <w:t xml:space="preserve">Hablar con Álvaro sobre la validación del modelo de ejes como artículo, y sobre coautoría.</w:t>
       </w:r>
     </w:p>
     <w:p>

</xml_diff>